<commit_message>
updated core python no dsa (02-09-2026)
</commit_message>
<xml_diff>
--- a/core_python final_list.docx
+++ b/core_python final_list.docx
@@ -1020,6 +1020,71 @@
       <w:pPr>
         <w:pStyle w:val="NormalWeb"/>
       </w:pPr>
+      <w:r>
+        <w:rPr>
+          <w:b/>
+          <w:bCs/>
+          <w:noProof/>
+        </w:rPr>
+        <mc:AlternateContent>
+          <mc:Choice Requires="wps">
+            <w:drawing>
+              <wp:anchor distT="0" distB="0" distL="114300" distR="114300" simplePos="0" relativeHeight="251659264" behindDoc="0" locked="0" layoutInCell="1" allowOverlap="1" wp14:anchorId="32014E4C" wp14:editId="5FF164A9">
+                <wp:simplePos x="0" y="0"/>
+                <wp:positionH relativeFrom="column">
+                  <wp:posOffset>-314077</wp:posOffset>
+                </wp:positionH>
+                <wp:positionV relativeFrom="paragraph">
+                  <wp:posOffset>98756</wp:posOffset>
+                </wp:positionV>
+                <wp:extent cx="3983604" cy="3976"/>
+                <wp:effectExtent l="0" t="0" r="36195" b="34290"/>
+                <wp:wrapNone/>
+                <wp:docPr id="1" name="Straight Connector 1"/>
+                <wp:cNvGraphicFramePr/>
+                <a:graphic xmlns:a="http://schemas.openxmlformats.org/drawingml/2006/main">
+                  <a:graphicData uri="http://schemas.microsoft.com/office/word/2010/wordprocessingShape">
+                    <wps:wsp>
+                      <wps:cNvCnPr/>
+                      <wps:spPr>
+                        <a:xfrm flipV="1">
+                          <a:off x="0" y="0"/>
+                          <a:ext cx="3983604" cy="3976"/>
+                        </a:xfrm>
+                        <a:prstGeom prst="line">
+                          <a:avLst/>
+                        </a:prstGeom>
+                      </wps:spPr>
+                      <wps:style>
+                        <a:lnRef idx="1">
+                          <a:schemeClr val="accent1"/>
+                        </a:lnRef>
+                        <a:fillRef idx="0">
+                          <a:schemeClr val="accent1"/>
+                        </a:fillRef>
+                        <a:effectRef idx="0">
+                          <a:schemeClr val="accent1"/>
+                        </a:effectRef>
+                        <a:fontRef idx="minor">
+                          <a:schemeClr val="tx1"/>
+                        </a:fontRef>
+                      </wps:style>
+                      <wps:bodyPr/>
+                    </wps:wsp>
+                  </a:graphicData>
+                </a:graphic>
+              </wp:anchor>
+            </w:drawing>
+          </mc:Choice>
+          <mc:Fallback>
+            <w:pict>
+              <v:line w14:anchorId="11BF8FF9" id="Straight Connector 1" o:spid="_x0000_s1026" style="position:absolute;flip:y;z-index:251659264;visibility:visible;mso-wrap-style:square;mso-wrap-distance-left:9pt;mso-wrap-distance-top:0;mso-wrap-distance-right:9pt;mso-wrap-distance-bottom:0;mso-position-horizontal:absolute;mso-position-horizontal-relative:text;mso-position-vertical:absolute;mso-position-vertical-relative:text" from="-24.75pt,7.8pt" to="288.9pt,8.1pt" o:gfxdata="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" strokecolor="#4472c4 [3204]" strokeweight=".5pt">
+                <v:stroke joinstyle="miter"/>
+              </v:line>
+            </w:pict>
+          </mc:Fallback>
+        </mc:AlternateContent>
+      </w:r>
       <w:r>
         <w:rPr>
           <w:rStyle w:val="Strong"/>

</xml_diff>